<commit_message>
Update MAXIMA documents and enhance structure for clarity
- Added a new section in README.md to clarify the first page for MAXIMA and its purpose.
- Revised multiple documents to improve clarity regarding the structure and content of MAXIMA materials, including updates to the handling of biological diversity and irrigation issues.
- Enhanced the index.html and innehall.html files to reflect updated word and character counts, ensuring accurate document statistics.
- Updated rangordning.html to clarify the ranking process and the current status of the group's work in stage 5.
- Incremented version number in README.md to 1.27, documenting the recent revisions and enhancements.
</commit_message>
<xml_diff>
--- a/Fritid/NF/Maxima/Yttrande/Utkast/Upplagg_A_med_andringsforslag_261026.docx
+++ b/Fritid/NF/Maxima/Yttrande/Utkast/Upplagg_A_med_andringsforslag_261026.docx
@@ -596,7 +596,16 @@
         <w:t>Om det renade avloppsvattnet i sin helhet släpps ut i Öresund kan kraven i denna förordning inte följas.</w:t>
       </w:r>
       <w:r>
-        <w:t xml:space="preserve"> LNF begär att VA SYD redovisar hur förordningens krav ska uppfyllas.</w:t>
+        <w:t xml:space="preserve"> LNF </w:t>
+      </w:r>
+      <w:r>
+        <w:rPr>
+          <w:shd w:val="clear" w:color="auto" w:fill="5CC16E"/>
+        </w:rPr>
+        <w:t>begär att VA SYD redovisar</w:t>
+      </w:r>
+      <w:r>
+        <w:t xml:space="preserve"> hur förordningens krav ska uppfyllas.</w:t>
       </w:r>
     </w:p>
     <w:p>
@@ -608,7 +617,19 @@
           <w:i/>
           <w:shd w:val="clear" w:color="auto" w:fill="FFB74D"/>
         </w:rPr>
-        <w:t>Förslag KL: Förordning (EU) 2020/741 gäller när renat avloppsvatten återanvänds för bevattning och kräver inte att någon återanvänder. VA SYD svarar just det (bemötandet sid. 91). Skriv om som en fråga: har återanvändning bedömts som alternativ eller hushållningsåtgärd (2 kap. 5 §, 6 kap. 35 § 2)? Se bilagans rad 5a i Utkast KL_261026.</w:t>
+        <w:t>Förslag KL: Behåll Leifs ändring till "konstaterar att VA SYD inte redovisar", som passar med "det som saknas" i Utkast KL_261026. Meningen "kan kraven inte följas" bör strykas: förordning (EU) 2020/741 gäller när renat avloppsvatten återanvänds för bevattning och kräver inte att någon återanvänder, och VA SYD svarar redan att den inte ingår i ansökan (bemötandet sid. 91). Argumentet om odlarna är däremot bra och bör stå som en följd av det minskade flödet i Höje å (punkt 1 i KL_261026) och i rad 5a: "Flera odlare nedströms Källby använder vatten från Höje å till bevattning. LNF konstaterar att VA SYD inte redovisar hur det minskade flödet påverkar bevattningen, eller om återanvändning av det renade vattnet har bedömts som alternativ (2 kap. 5 §, 6 kap. 35 § 2)." Källa till att odlarna använder vattnet behövs.</w:t>
+      </w:r>
+    </w:p>
+    <w:p>
+      <w:pPr>
+        <w:ind w:left="360"/>
+      </w:pPr>
+      <w:r>
+        <w:rPr>
+          <w:i/>
+          <w:shd w:val="clear" w:color="auto" w:fill="5CC16E"/>
+        </w:rPr>
+        <w:t>Synpunkt: Ändra "LNF begär att VA SYD redovisar" till "LNF konstaterar att VA SYD inte redovisar", eftersom det inte är rätt tillfälle att be om kompletteringar. Behåll meningen "Om det renade avloppsvattnet i sin helhet släpps ut i Öresund kan kraven i denna förordning inte följas", med motiveringen att flera bönder nedströms Källby använder vatten från Höje å till sina odlingar.</w:t>
       </w:r>
     </w:p>
     <w:p>
@@ -691,7 +712,7 @@
           <w:i/>
           <w:shd w:val="clear" w:color="auto" w:fill="FFB74D"/>
         </w:rPr>
-        <w:t>Förslag KL: Sidhänvisning saknas. Påståendet om fåglars bullerkänslighet har inte hittats i bemötandet. Ange sida eller stryk. Övriga "felaktigheter" bör hänvisa till VA SYDs nummer och sida (se bilagan i Utkast KL_261026).</w:t>
+        <w:t>Förslag KL: Sidhänvisning: VA SYD:s svar på LNF:s punkt 4a, sid. 90 i bemötandet (PDF-sida 92 i underrättelsepaketet), med muddringen på sid. 91. Texten säger att fåglar tillvänjs buller och beskriver muddringens omfattning. LNF:s eget yttrande (aktbilaga 257) innehåller inte orden buller eller muddring enligt en textsökning i den markerade kopian, vilket stöder att uppgiften är VA SYD:s. Kontrollera sökningen mot PDF:en. Övriga "felaktigheter" bör hänvisa till VA SYD:s nummer och sida (se bilagan i Utkast KL_261026).</w:t>
       </w:r>
     </w:p>
     <w:p>

</xml_diff>

<commit_message>
samradsguiden uppdaterad till version 1.25 (26 okt 2026)
</commit_message>
<xml_diff>
--- a/Fritid/NF/Maxima/Yttrande/Utkast/Upplagg_A_med_andringsforslag_261026.docx
+++ b/Fritid/NF/Maxima/Yttrande/Utkast/Upplagg_A_med_andringsforslag_261026.docx
@@ -1511,7 +1511,20 @@
         <w:rPr>
           <w:lang w:val="sv-SE"/>
         </w:rPr>
-        <w:t xml:space="preserve"> LNF begär att VA SYD redovisar hur förordningens krav ska uppfyllas.</w:t>
+        <w:t xml:space="preserve"> LNF </w:t>
+      </w:r>
+      <w:r>
+        <w:rPr>
+          <w:lang w:val="sv-SE"/>
+          <w:shd w:val="clear" w:color="auto" w:fill="5CC16E"/>
+        </w:rPr>
+        <w:t>begär att VA SYD redovisar</w:t>
+      </w:r>
+      <w:r>
+        <w:rPr>
+          <w:lang w:val="sv-SE"/>
+        </w:rPr>
+        <w:t xml:space="preserve"> hur förordningens krav ska uppfyllas.</w:t>
       </w:r>
     </w:p>
     <w:p>
@@ -1524,10 +1537,26 @@
       <w:r>
         <w:rPr>
           <w:i/>
+          <w:shd w:val="clear" w:color="auto" w:fill="5CC16E"/>
+          <w:lang w:val="sv-SE"/>
+        </w:rPr>
+        <w:t>Synpunkt: Ändra "LNF begär att VA SYD redovisar" till "LNF konstaterar att VA SYD inte redovisar", eftersom det inte är rätt tillfälle att be om kompletteringar. Behåll meningen "Om det renade avloppsvattnet i sin helhet släpps ut i Öresund kan kraven i denna förordning inte följas", med motiveringen att flera bönder nedströms Källby använder vatten från Höje å till sina odlingar.</w:t>
+      </w:r>
+    </w:p>
+    <w:p>
+      <w:pPr>
+        <w:ind w:left="360"/>
+        <w:rPr>
+          <w:lang w:val="sv-SE"/>
+        </w:rPr>
+      </w:pPr>
+      <w:r>
+        <w:rPr>
+          <w:i/>
           <w:shd w:val="clear" w:color="auto" w:fill="FFB74D"/>
           <w:lang w:val="sv-SE"/>
         </w:rPr>
-        <w:t xml:space="preserve">Förslag KL: Förordning (EU) 2020/741 gäller när renat avloppsvatten återanvänds för bevattning och kräver inte att någon återanvänder. VA SYD svarar just det (bemötandet sid. 91). Skriv om som en fråga: har återanvändning bedömts som alternativ eller hushållningsåtgärd (2 kap. 5 §, 6 kap. 35 § 2)? Se bilagans rad 5a i Utkast </w:t>
+        <w:t>Förslag KL: Behåll ändringen till "konstaterar att VA SYD inte redovisar", som passar med "det som saknas" i Utkast KL_261026. Meningen "kan kraven inte följas" bör strykas: förordning (EU) 2020/741 gäller när renat avloppsvatten återanvänds för bevattning och kräver inte att någon återanvänder, och VA SYD svarar redan att den inte ingår i ansökan (bemötandet sid. 91). Argumentet om odlarna är däremot bra och bör stå som en följd av det minskade flödet i Höje å (punkt 1 i KL_261026) och i rad 5a: "Flera odlare nedströms Källby använder vatten från Höje å till bevattning. LNF konstaterar att VA SYD inte redovisar hur det minskade flödet påverkar bevattningen, eller om återanvändning av det renade vattnet har bedömts som alternativ (2 kap. 5 §, 6 kap. 35 § 2)." Källa till att odlarna använder vattnet behövs.</w:t>
       </w:r>
       <w:hyperlink r:id="rId12" w:history="1">
         <w:r>
@@ -1736,7 +1765,7 @@
           <w:shd w:val="clear" w:color="auto" w:fill="FFB74D"/>
           <w:lang w:val="sv-SE"/>
         </w:rPr>
-        <w:t xml:space="preserve">Förslag KL: Sidhänvisning saknas. Påståendet om fåglars bullerkänslighet har inte hittats i bemötandet. Ange sida eller stryk. </w:t>
+        <w:t>Förslag KL: Sidhänvisning: VA SYD:s svar på LNF:s punkt 4a, sid. 90 i bemötandet (PDF-sida 92 i underrättelsepaketet), med muddringen på sid. 91. Texten säger att fåglar tillvänjs buller och beskriver muddringens omfattning. LNF:s eget yttrande (aktbilaga 257) innehåller inte orden buller eller muddring enligt en textsökning i den markerade kopian, vilket stöder att uppgiften är VA SYD:s. Kontrollera sökningen mot PDF:en.</w:t>
       </w:r>
     </w:p>
     <w:p>

</xml_diff>

<commit_message>
Update Upplagg A and Utkast documents with new references and clarifications
- Revised the Upplagg A draft to include additional requests for reporting as outlined in aktbilaga 257, ensuring all previous requests are maintained for potential appeals.
- Enhanced the Utkast documents to clarify LNF's position on the lack of new information in VA SYD's responses, reinforcing the need for comprehensive documentation.
- Updated both documents to improve clarity and consistency in language, reflecting the latest discussions as of 2026-10-26.
</commit_message>
<xml_diff>
--- a/Fritid/NF/Maxima/Yttrande/Utkast/Upplagg_A_med_andringsforslag_261026.docx
+++ b/Fritid/NF/Maxima/Yttrande/Utkast/Upplagg_A_med_andringsforslag_261026.docx
@@ -391,6 +391,48 @@
         </w:rPr>
         <w:t>frånsett några förtydliganden.</w:t>
       </w:r>
+      <w:r>
+        <w:rPr>
+          <w:lang w:val="sv-SE"/>
+          <w:shd w:val="clear" w:color="auto" w:fill="FFB74D"/>
+        </w:rPr>
+        <w:t xml:space="preserve"> LNF vidhåller de begäranden om redovisning som framställts i </w:t>
+      </w:r>
+      <w:hyperlink r:id="rId21">
+        <w:r>
+          <w:rPr>
+            <w:lang w:val="sv-SE"/>
+            <w:shd w:val="clear" w:color="auto" w:fill="FFB74D"/>
+            <w:u w:val="single"/>
+          </w:rPr>
+          <w:t xml:space="preserve">aktbilaga 257</w:t>
+        </w:r>
+      </w:hyperlink>
+      <w:r>
+        <w:rPr>
+          <w:lang w:val="sv-SE"/>
+          <w:shd w:val="clear" w:color="auto" w:fill="FFB74D"/>
+        </w:rPr>
+        <w:t xml:space="preserve">.</w:t>
+      </w:r>
+    </w:p>
+    <w:p>
+      <w:pPr>
+        <w:ind w:left="360"/>
+        <w:rPr>
+          <w:lang w:val="sv-SE"/>
+        </w:rPr>
+      </w:pPr>
+      <w:r>
+        <w:rPr>
+          <w:i/>
+          <w:shd w:val="clear" w:color="auto" w:fill="FFB74D"/>
+          <w:lang w:val="sv-SE"/>
+        </w:rPr>
+        <w:t>Förslag KL: Behåll "det som saknas" i punkterna och lägg en mening i inledningen om att LNF vidhåller de begäranden om redovisning som framställts i aktbilaga 257. Då finns begäran kvar, och det går att visa vid ett eventuellt överklagande att den framställts, utan att varje punkt ser ut som en begäran om komplettering.</w:t>
+      </w:r>
+      <w:proofErr w:type="spellStart"/>
+      <w:proofErr w:type="spellEnd"/>
     </w:p>
     <w:p>
       <w:pPr>

</xml_diff>

<commit_message>
Revise Upplagg A and Utkast documents to clarify LNF's position on verkställighetsförordnande
- Updated the Upplagg A draft to remove ambiguous language regarding LNF's stance on the verkställighetsförordnande, ensuring clarity on the lack of grounds for approval.
- Enhanced the Utkast documents with detailed proposals and clarifications on the conditions under which LNF would accept a verkställighetsförordnande, emphasizing the need for specific information from VA SYD.
- Made adjustments to improve overall consistency and clarity in the documentation, reflecting the latest discussions as of 2026-10-26.
</commit_message>
<xml_diff>
--- a/Fritid/NF/Maxima/Yttrande/Utkast/Upplagg_A_med_andringsforslag_261026.docx
+++ b/Fritid/NF/Maxima/Yttrande/Utkast/Upplagg_A_med_andringsforslag_261026.docx
@@ -1889,6 +1889,7 @@
         <w:rPr>
           <w:shd w:val="clear" w:color="auto" w:fill="D6E3BC" w:themeFill="accent3" w:themeFillTint="66"/>
           <w:lang w:val="sv-SE"/>
+          <w:strike/>
         </w:rPr>
         <w:t>har LNF inget underlag för att ändra sitt yrkande.</w:t>
       </w:r>
@@ -1915,6 +1916,53 @@
         </w:rPr>
         <w:t>Synpunkt: Motiveringen till varför vi inte går med på något verkställighetsförordnande bör behållas. Man kan inte säga ja till något man inte vet något konkret om.</w:t>
       </w:r>
+    </w:p>
+    <w:p>
+      <w:pPr>
+        <w:ind w:left="360"/>
+        <w:rPr>
+          <w:lang w:val="sv-SE"/>
+        </w:rPr>
+      </w:pPr>
+      <w:r>
+        <w:rPr>
+          <w:i/>
+          <w:shd w:val="clear" w:color="auto" w:fill="FFB74D"/>
+          <w:lang w:val="sv-SE"/>
+        </w:rPr>
+        <w:t>Förslag KL (ersätter stycket ovan): LNF yrkar att yrkandet om verkställighetsförordnande avslås. Ett förordnande förutsätter att det finns skäl för det (22 kap. 28 §), och VA SYD har inte visat några. Det som saknas är uppgift om vilka åtgärder som inte kan vänta till laga kraft (VA SYD:s punkt 7.148, 7.149; sid. 94–95) och varför de inte kan genomföras inom gällande tillstånd. Domstolen kan inte pröva om det finns skäl för arbeten som inte har specificerats. Om VA SYD tecknar avtal om framtida arbeten under handläggningstiden sker det på egen risk. Skulle VA SYD senare ange vilka arbeten det gäller får LNF återkomma.</w:t>
+      </w:r>
+      <w:proofErr w:type="spellStart"/>
+      <w:proofErr w:type="spellEnd"/>
+    </w:p>
+    <w:p>
+      <w:pPr>
+        <w:ind w:left="360"/>
+        <w:rPr>
+          <w:lang w:val="sv-SE"/>
+        </w:rPr>
+      </w:pPr>
+      <w:r>
+        <w:rPr>
+          <w:i/>
+          <w:shd w:val="clear" w:color="auto" w:fill="FFB74D"/>
+          <w:lang w:val="sv-SE"/>
+        </w:rPr>
+        <w:t xml:space="preserve">Förslag KL: Skilj på verben. "LNF yrkar" riktar sig till domstolen, "det som saknas" gäller bristen i VA SYD:s underlag, och "får återkomma" lovar inget. Då kan texten inte läsas som att LNF ändrar sig om VA SYD kompletterar. Se Samrådsguiden, Hur man uttrycker sig: </w:t>
+      </w:r>
+      <w:hyperlink r:id="rId22">
+        <w:r>
+          <w:rPr>
+            <w:i/>
+            <w:shd w:val="clear" w:color="auto" w:fill="FFB74D"/>
+            <w:lang w:val="sv-SE"/>
+            <w:u/>
+          </w:rPr>
+          <w:t>https://kentlundgren.github.io/Codex/Fritid/NF/Samradsguiden/fordjupning.html#uttryckasig</w:t>
+        </w:r>
+      </w:hyperlink>
+      <w:proofErr w:type="spellStart"/>
+      <w:proofErr w:type="spellEnd"/>
     </w:p>
     <w:p>
       <w:pPr>

</xml_diff>

<commit_message>
Update MAXIMA documents with latest version of yttrande and clarifications
- Revised the Yttrande över bemötandet to include the latest version dated 2026-10-29, which follows upplägg A and omits names of signatories.
- Enhanced the Upplagg A and Utkast documents with additional references and clarifications based on group feedback, ensuring consistency and clarity in language.
- Updated `maxima.html` and `README.md` to reflect these changes, including links to the latest documents and adjustments to the version number to 1.30.
</commit_message>
<xml_diff>
--- a/Fritid/NF/Maxima/Yttrande/Utkast/Upplagg_A_med_andringsforslag_261026.docx
+++ b/Fritid/NF/Maxima/Yttrande/Utkast/Upplagg_A_med_andringsforslag_261026.docx
@@ -851,6 +851,13 @@
         </w:rPr>
         <w:t>Miljökonsekvensbeskrivningen är ofullständig</w:t>
       </w:r>
+      <w:r>
+        <w:rPr>
+          <w:lang w:val="sv-SE"/>
+          <w:shd w:val="clear" w:color="auto" w:fill="FFB74D"/>
+        </w:rPr>
+        <w:t xml:space="preserve"> och felaktig</w:t>
+      </w:r>
     </w:p>
     <w:p>
       <w:pPr>
@@ -1112,7 +1119,7 @@
           <w:shd w:val="clear" w:color="auto" w:fill="FFB74D"/>
           <w:lang w:val="sv-SE"/>
         </w:rPr>
-        <w:t>(2026-xx-xx)</w:t>
+        <w:t>(aktbilaga 257, inkom 2026-06-09)</w:t>
       </w:r>
       <w:r>
         <w:rPr>
@@ -1151,26 +1158,10 @@
           <w:shd w:val="clear" w:color="auto" w:fill="FFB74D"/>
           <w:lang w:val="sv-SE"/>
         </w:rPr>
-        <w:t xml:space="preserve">Förslag KL: Fyll i datum. </w:t>
+        <w:t>Förslag KL: Hänvisningen anger aktbilaga 257 och att yttrandet inkom 2026-06-09 enligt domstolens stämpel. Versionen på hemsidan är daterad 2026-05-28. Kontrollera vilket datum som står i själva dokumentet, och skriv det i så fall också.</w:t>
       </w:r>
       <w:proofErr w:type="spellStart"/>
-      <w:r>
-        <w:rPr>
-          <w:i/>
-          <w:shd w:val="clear" w:color="auto" w:fill="FFB74D"/>
-          <w:lang w:val="sv-SE"/>
-        </w:rPr>
-        <w:t>Aktbilaga</w:t>
-      </w:r>
       <w:proofErr w:type="spellEnd"/>
-      <w:r>
-        <w:rPr>
-          <w:i/>
-          <w:shd w:val="clear" w:color="auto" w:fill="FFB74D"/>
-          <w:lang w:val="sv-SE"/>
-        </w:rPr>
-        <w:t xml:space="preserve"> 257 är daterad 2026-06-09 </w:t>
-      </w:r>
     </w:p>
     <w:p>
       <w:pPr>

</xml_diff>